<commit_message>
De-AI language pass (v5): rewrite prose in top-journal register - 37->1 em dashes, drop promotional adjectives/bold emphasis/italic emphasis/-ing tails/rule-of-three, unify BMD->OA verb; cover letter + medRxiv/OSF English cleaned; fix stale 4.3 beta (0.086/0.402 -> 0.092/0.395, matches Table 3); build_submission now aborts on unresolved [REF]; Submission_Package_v5.zip.
</commit_message>
<xml_diff>
--- a/submission_package_v2/Cover_Letter.docx
+++ b/submission_package_v2/Cover_Letter.docx
@@ -92,7 +92,7 @@
           <w:b/>
           <w:sz w:val="22"/>
         </w:rPr>
-        <w:t>Re: Submission of original research — “Bone Mineral Density and Osteoarthritis Share Genetic Architecture but Not Causal Pathways to Fracture: A Cross-Trait Analysis of 13 Skeletal Phenotypes”</w:t>
+        <w:t>Re: Submission of original research: "Bone Mineral Density and Osteoarthritis Share Genetic Architecture but Not Causal Pathways to Fracture: A Cross-Trait Analysis of 13 Skeletal Phenotypes"</w:t>
       </w:r>
     </w:p>
     <w:p>
@@ -138,7 +138,7 @@
           <w:b w:val="0"/>
           <w:sz w:val="22"/>
         </w:rPr>
-        <w:t>Osteoarthritis (OA) and bone mineral density (BMD) are clinically entangled, yet whether their association reflects shared genetic aetiology, causal direction, or confounding has remained unresolved. We addressed this by analysing 13 skeletal phenotypes — two OA definitions, ten regional BMD sites, and any-fracture — with (i) LDSC across all 78 phenotype pairs on a common SNP set, (ii) two-sample Mendelian randomisation for causal direction with a built-in positive control (BMD→fracture), and (iii) reverse MR to discriminate BMD→OA from OA→BMD. Instruments used strict PLINK-equivalent clumping (r²&lt;0.001 over 10 Mb, 1000G Phase 3 EUR), and the MR-PRESSO distortion test was applied to all pairs.</w:t>
+        <w:t>People with osteoarthritis (OA) tend to have higher bone mineral density (BMD), yet whether this reflects shared genetic aetiology, causal direction, or confounding has remained unresolved. We addressed this in 13 skeletal phenotypes (two OA definitions, ten regional BMD sites, and any-fracture), using LDSC across all 78 phenotype pairs on a common SNP set, two-sample Mendelian randomisation for causal direction with an internal positive control (BMD→fracture), and reverse MR to distinguish BMD→OA from OA→BMD. Instruments were selected by strict PLINK-equivalent clumping (r²&lt;0.001 over 10 Mb, 1000G Phase 3 EUR), and the MR-PRESSO distortion test was applied to all pairs.</w:t>
       </w:r>
     </w:p>
     <w:p>
@@ -161,7 +161,7 @@
           <w:b w:val="0"/>
           <w:sz w:val="22"/>
         </w:rPr>
-        <w:t>Our principal findings are: (1) a coherent three-block genetic architecture (BMD sites strongly inter-correlated; OA uniformly positively correlated with all BMD sites; fracture negatively correlated with all BMD sites, replicating the canonical relationship as a pipeline validation); (2) genetically elevated BMD causally increases knee OA risk, whereas OA does not causally raise BMD and has no causal effect on fracture; and (3) the BMD→fracture MR estimate (OR 1.40–1.42 per SD lower BMD) agrees within ~10% with the independent GEFOS consortium benchmark (OR 1.55), externally validating the pipeline. These results reconcile the long-standing OA–BMD paradox and suggest that interventions increasing bone mass should be evaluated for site-specific OA consequences.</w:t>
+        <w:t>Our principal findings are: (1) a three-block genetic architecture (BMD sites strongly inter-correlated; OA positively correlated with all BMD sites; fracture negatively correlated with all BMD sites, replicating the established relationship and validating the pipeline); (2) genetically higher BMD raises knee OA risk, whereas OA does not raise BMD and has no causal effect on fracture; and (3) the BMD→fracture MR estimate (OR 1.40–1.42 per SD lower BMD) falls within about 10% of the independent GEFOS consortium benchmark (OR 1.55). These results resolve the long-standing OA–BMD paradox, and they argue for site-specific assessment of OA outcomes when bone mass is increased.</w:t>
       </w:r>
     </w:p>
     <w:p>
@@ -184,7 +184,7 @@
           <w:b w:val="0"/>
           <w:sz w:val="22"/>
         </w:rPr>
-        <w:t>We believe this manuscript fits Bone because it centres on the genetics of bone density, fracture and their skeletal comorbidity with OA, and provides an independent external validation of the established BMD–fracture relationship while extending it to OA causality. All summary statistics derive from publicly published, consortium-approved GWAS and were not redistributed; full provenance, accessions and reproducibility commands are provided in the Data availability statement and Supplementary material.</w:t>
+        <w:t>This manuscript fits Bone because it centres on the genetics of bone density and fracture and their skeletal comorbidity with OA, and because it independently reproduces the established BMD–fracture relationship and extends it to OA causality. All summary statistics come from publicly published, consortium-approved GWAS and were not redistributed; full provenance, accessions and reproducibility commands are provided in the Data availability statement and Supplementary material.</w:t>
       </w:r>
     </w:p>
     <w:p>
@@ -230,7 +230,7 @@
           <w:b w:val="0"/>
           <w:sz w:val="22"/>
         </w:rPr>
-        <w:t>We look forward to your editorial assessment.</w:t>
+        <w:t>We hope the manuscript can be assessed for publication in Bone.</w:t>
       </w:r>
     </w:p>
     <w:p>
@@ -312,7 +312,7 @@
           <w:b w:val="0"/>
           <w:sz w:val="20"/>
         </w:rPr>
-        <w:t>On behalf of all authors — Zhenxin Zheng#, Song Chen#, Shenbo Huang, Chao Qian, Hang Yuan, Huricha Bao*, Qiuyan Jiang*</w:t>
+        <w:t>On behalf of all authors: Zhenxin Zheng#, Song Chen#, Shenbo Huang, Chao Qian, Hang Yuan, Huricha Bao*, Qiuyan Jiang*</w:t>
       </w:r>
     </w:p>
     <w:sectPr>

</xml_diff>